<commit_message>
docs: add Front Pages STE PDF and update source document
</commit_message>
<xml_diff>
--- a/TY STE Front Pages.docx
+++ b/TY STE Front Pages.docx
@@ -2255,6 +2255,26 @@
           <w14:ligatures w14:val="standardContextual"/>
         </w:rPr>
       </w:pPr>
+    </w:p>
+    <w:p>
+      <w:pPr>
+        <w:keepNext/>
+        <w:keepLines/>
+        <w:spacing w:after="28"/>
+        <w:ind w:right="646"/>
+        <w:jc w:val="center"/>
+        <w:outlineLvl w:val="1"/>
+        <w:rPr>
+          <w:rFonts w:ascii="Times New Roman" w:eastAsia="Times New Roman" w:hAnsi="Times New Roman" w:cs="Times New Roman"/>
+          <w:b/>
+          <w:color w:val="000000"/>
+          <w:kern w:val="2"/>
+          <w:sz w:val="36"/>
+          <w:szCs w:val="36"/>
+          <w:lang w:eastAsia="en-IN"/>
+          <w14:ligatures w14:val="standardContextual"/>
+        </w:rPr>
+      </w:pPr>
       <w:r>
         <w:rPr>
           <w:rFonts w:ascii="Times New Roman" w:eastAsia="Times New Roman" w:hAnsi="Times New Roman" w:cs="Times New Roman"/>
@@ -2410,17 +2430,7 @@
                 <w:szCs w:val="24"/>
                 <w:lang w:eastAsia="en-IN"/>
               </w:rPr>
-              <w:t>Page. No.</w:t>
-            </w:r>
-            <w:r>
-              <w:rPr>
-                <w:rFonts w:ascii="Times New Roman" w:eastAsia="Times New Roman" w:hAnsi="Times New Roman" w:cs="Times New Roman"/>
-                <w:b/>
-                <w:sz w:val="24"/>
-                <w:szCs w:val="24"/>
-                <w:lang w:eastAsia="en-IN"/>
-              </w:rPr>
-              <w:t xml:space="preserve"> </w:t>
+              <w:t xml:space="preserve">Page. No. </w:t>
             </w:r>
           </w:p>
         </w:tc>
@@ -5130,10 +5140,6 @@
 </file>
 
 <file path=customXml/item1.xml><?xml version="1.0" encoding="utf-8"?>
-<b:Sources xmlns:b="http://schemas.openxmlformats.org/officeDocument/2006/bibliography" xmlns="http://schemas.openxmlformats.org/officeDocument/2006/bibliography" SelectedStyle="\APASixthEditionOfficeOnline.xsl" StyleName="APA" Version="6"/>
-</file>
-
-<file path=customXml/item2.xml><?xml version="1.0" encoding="utf-8"?>
 <s:customData xmlns="http://www.wps.cn/officeDocument/2013/wpsCustomData" xmlns:s="http://www.wps.cn/officeDocument/2013/wpsCustomData">
   <customSectProps/>
   <customShpExts>
@@ -5142,18 +5148,22 @@
 </s:customData>
 </file>
 
+<file path=customXml/item2.xml><?xml version="1.0" encoding="utf-8"?>
+<b:Sources xmlns:b="http://schemas.openxmlformats.org/officeDocument/2006/bibliography" xmlns="http://schemas.openxmlformats.org/officeDocument/2006/bibliography" SelectedStyle="\APASixthEditionOfficeOnline.xsl" StyleName="APA" Version="6"/>
+</file>
+
 <file path=customXml/itemProps1.xml><?xml version="1.0" encoding="utf-8"?>
+<ds:datastoreItem xmlns:ds="http://schemas.openxmlformats.org/officeDocument/2006/customXml" ds:itemID="{B1977F7D-205B-4081-913C-38D41E755F92}">
+  <ds:schemaRefs>
+    <ds:schemaRef ds:uri="http://www.wps.cn/officeDocument/2013/wpsCustomData"/>
+  </ds:schemaRefs>
+</ds:datastoreItem>
+</file>
+
+<file path=customXml/itemProps2.xml><?xml version="1.0" encoding="utf-8"?>
 <ds:datastoreItem xmlns:ds="http://schemas.openxmlformats.org/officeDocument/2006/customXml" ds:itemID="{90449715-4D94-4DBF-8077-B453F49E8ECF}">
   <ds:schemaRefs>
     <ds:schemaRef ds:uri="http://schemas.openxmlformats.org/officeDocument/2006/bibliography"/>
   </ds:schemaRefs>
 </ds:datastoreItem>
-</file>
-
-<file path=customXml/itemProps2.xml><?xml version="1.0" encoding="utf-8"?>
-<ds:datastoreItem xmlns:ds="http://schemas.openxmlformats.org/officeDocument/2006/customXml" ds:itemID="{B1977F7D-205B-4081-913C-38D41E755F92}">
-  <ds:schemaRefs>
-    <ds:schemaRef ds:uri="http://www.wps.cn/officeDocument/2013/wpsCustomData"/>
-  </ds:schemaRefs>
-</ds:datastoreItem>
 </file>
</xml_diff>